<commit_message>
Guard signing flow and late field overflow
Add end-to-end handling for staff-entered late fields that can overflow fixed PDF boxes: introduce LateFieldFit checks, a new API endpoint, and browser-side live validation/highlighting. Update workflow behavior to block send/forward when staff values do not fit, produce clearer field-specific error messages, and stop silently falling back to legacy mode when incremental PDF preparation fails (with retry + hard refusal). Also fix admin form lock behavior (keep preview usable, lock data-target checkboxes correctly), adjust required-field script note logic, widen doc_2 remark layout, and add unit/E2E tests covering these regressions.
</commit_message>
<xml_diff>
--- a/HRCP-KKU-Academic/src/main/resources/templates/docx/doc_2.docx
+++ b/HRCP-KKU-Academic/src/main/resources/templates/docx/doc_2.docx
@@ -86,16 +86,16 @@
       </w:tblPr>
       <w:tblGrid>
         <w:gridCol w:w="660"/>
-        <w:gridCol w:w="4322"/>
-        <w:gridCol w:w="768"/>
-        <w:gridCol w:w="1359"/>
-        <w:gridCol w:w="1265"/>
-        <w:gridCol w:w="976"/>
+        <w:gridCol w:w="4250"/>
+        <w:gridCol w:w="800"/>
+        <w:gridCol w:w="850"/>
+        <w:gridCol w:w="1050"/>
+        <w:gridCol w:w="1740"/>
       </w:tblGrid>
       <w:tr>
         <w:tc>
           <w:tcPr>
-            <w:tcW w:w="421" w:type="dxa"/>
+            <w:tcW w:w="660" w:type="dxa"/>
             <w:vMerge w:val="restart"/>
           </w:tcPr>
           <w:p>
@@ -126,7 +126,7 @@
         </w:tc>
         <w:tc>
           <w:tcPr>
-            <w:tcW w:w="4591" w:type="dxa"/>
+            <w:tcW w:w="4250" w:type="dxa"/>
             <w:vMerge w:val="restart"/>
           </w:tcPr>
           <w:p>
@@ -157,7 +157,7 @@
         </w:tc>
         <w:tc>
           <w:tcPr>
-            <w:tcW w:w="738" w:type="dxa"/>
+            <w:tcW w:w="800" w:type="dxa"/>
             <w:vMerge w:val="restart"/>
           </w:tcPr>
           <w:p>
@@ -188,7 +188,7 @@
         </w:tc>
         <w:tc>
           <w:tcPr>
-            <w:tcW w:w="2624" w:type="dxa"/>
+            <w:tcW w:w="1900" w:type="dxa"/>
             <w:gridSpan w:val="2"/>
           </w:tcPr>
           <w:p>
@@ -219,7 +219,7 @@
         </w:tc>
         <w:tc>
           <w:tcPr>
-            <w:tcW w:w="976" w:type="dxa"/>
+            <w:tcW w:w="1740" w:type="dxa"/>
             <w:vMerge w:val="restart"/>
           </w:tcPr>
           <w:p>
@@ -252,7 +252,7 @@
       <w:tr>
         <w:tc>
           <w:tcPr>
-            <w:tcW w:w="421" w:type="dxa"/>
+            <w:tcW w:w="660" w:type="dxa"/>
             <w:vMerge/>
           </w:tcPr>
           <w:p>
@@ -272,7 +272,7 @@
         </w:tc>
         <w:tc>
           <w:tcPr>
-            <w:tcW w:w="4591" w:type="dxa"/>
+            <w:tcW w:w="4250" w:type="dxa"/>
             <w:vMerge/>
           </w:tcPr>
           <w:p>
@@ -291,7 +291,7 @@
         </w:tc>
         <w:tc>
           <w:tcPr>
-            <w:tcW w:w="738" w:type="dxa"/>
+            <w:tcW w:w="800" w:type="dxa"/>
             <w:vMerge/>
           </w:tcPr>
           <w:p>
@@ -310,7 +310,7 @@
         </w:tc>
         <w:tc>
           <w:tcPr>
-            <w:tcW w:w="1359" w:type="dxa"/>
+            <w:tcW w:w="850" w:type="dxa"/>
           </w:tcPr>
           <w:p>
             <w:pPr>
@@ -340,7 +340,7 @@
         </w:tc>
         <w:tc>
           <w:tcPr>
-            <w:tcW w:w="1265" w:type="dxa"/>
+            <w:tcW w:w="1050" w:type="dxa"/>
           </w:tcPr>
           <w:p>
             <w:pPr>
@@ -369,7 +369,7 @@
         </w:tc>
         <w:tc>
           <w:tcPr>
-            <w:tcW w:w="976" w:type="dxa"/>
+            <w:tcW w:w="1740" w:type="dxa"/>
             <w:vMerge/>
           </w:tcPr>
           <w:p>
@@ -390,7 +390,7 @@
       <w:tr>
         <w:tc>
           <w:tcPr>
-            <w:tcW w:w="421" w:type="dxa"/>
+            <w:tcW w:w="660" w:type="dxa"/>
           </w:tcPr>
           <w:p>
             <w:pPr>
@@ -416,7 +416,7 @@
         </w:tc>
         <w:tc>
           <w:tcPr>
-            <w:tcW w:w="4591" w:type="dxa"/>
+            <w:tcW w:w="4250" w:type="dxa"/>
           </w:tcPr>
           <w:p>
             <w:pPr>
@@ -441,7 +441,7 @@
         </w:tc>
         <w:tc>
           <w:tcPr>
-            <w:tcW w:w="738" w:type="dxa"/>
+            <w:tcW w:w="800" w:type="dxa"/>
           </w:tcPr>
           <w:p>
             <w:pPr>
@@ -467,7 +467,7 @@
         </w:tc>
         <w:tc>
           <w:tcPr>
-            <w:tcW w:w="1359" w:type="dxa"/>
+            <w:tcW w:w="850" w:type="dxa"/>
           </w:tcPr>
           <w:p>
             <w:pPr>
@@ -492,7 +492,7 @@
         </w:tc>
         <w:tc>
           <w:tcPr>
-            <w:tcW w:w="1265" w:type="dxa"/>
+            <w:tcW w:w="1050" w:type="dxa"/>
           </w:tcPr>
           <w:p>
             <w:pPr>
@@ -517,7 +517,7 @@
         </w:tc>
         <w:tc>
           <w:tcPr>
-            <w:tcW w:w="976" w:type="dxa"/>
+            <w:tcW w:w="1740" w:type="dxa"/>
           </w:tcPr>
           <w:p>
             <w:pPr>
@@ -543,7 +543,7 @@
       <w:tr>
         <w:tc>
           <w:tcPr>
-            <w:tcW w:w="421" w:type="dxa"/>
+            <w:tcW w:w="660" w:type="dxa"/>
           </w:tcPr>
           <w:p>
             <w:pPr>
@@ -569,7 +569,7 @@
         </w:tc>
         <w:tc>
           <w:tcPr>
-            <w:tcW w:w="4591" w:type="dxa"/>
+            <w:tcW w:w="4250" w:type="dxa"/>
           </w:tcPr>
           <w:p>
             <w:pPr>
@@ -594,7 +594,7 @@
         </w:tc>
         <w:tc>
           <w:tcPr>
-            <w:tcW w:w="738" w:type="dxa"/>
+            <w:tcW w:w="800" w:type="dxa"/>
           </w:tcPr>
           <w:p>
             <w:pPr>
@@ -620,7 +620,7 @@
         </w:tc>
         <w:tc>
           <w:tcPr>
-            <w:tcW w:w="1359" w:type="dxa"/>
+            <w:tcW w:w="850" w:type="dxa"/>
           </w:tcPr>
           <w:p>
             <w:pPr>
@@ -663,7 +663,7 @@
         </w:tc>
         <w:tc>
           <w:tcPr>
-            <w:tcW w:w="1265" w:type="dxa"/>
+            <w:tcW w:w="1050" w:type="dxa"/>
           </w:tcPr>
           <w:p>
             <w:pPr>
@@ -706,7 +706,7 @@
         </w:tc>
         <w:tc>
           <w:tcPr>
-            <w:tcW w:w="976" w:type="dxa"/>
+            <w:tcW w:w="1740" w:type="dxa"/>
           </w:tcPr>
           <w:p>
             <w:pPr>
@@ -750,7 +750,7 @@
       <w:tr>
         <w:tc>
           <w:tcPr>
-            <w:tcW w:w="421" w:type="dxa"/>
+            <w:tcW w:w="660" w:type="dxa"/>
           </w:tcPr>
           <w:p>
             <w:pPr>
@@ -776,7 +776,7 @@
         </w:tc>
         <w:tc>
           <w:tcPr>
-            <w:tcW w:w="4591" w:type="dxa"/>
+            <w:tcW w:w="4250" w:type="dxa"/>
           </w:tcPr>
           <w:p>
             <w:pPr>
@@ -812,7 +812,7 @@
         </w:tc>
         <w:tc>
           <w:tcPr>
-            <w:tcW w:w="738" w:type="dxa"/>
+            <w:tcW w:w="800" w:type="dxa"/>
           </w:tcPr>
           <w:p>
             <w:pPr>
@@ -838,7 +838,7 @@
         </w:tc>
         <w:tc>
           <w:tcPr>
-            <w:tcW w:w="1359" w:type="dxa"/>
+            <w:tcW w:w="850" w:type="dxa"/>
           </w:tcPr>
           <w:p>
             <w:pPr>
@@ -881,7 +881,7 @@
         </w:tc>
         <w:tc>
           <w:tcPr>
-            <w:tcW w:w="1265" w:type="dxa"/>
+            <w:tcW w:w="1050" w:type="dxa"/>
           </w:tcPr>
           <w:p>
             <w:pPr>
@@ -924,7 +924,7 @@
         </w:tc>
         <w:tc>
           <w:tcPr>
-            <w:tcW w:w="976" w:type="dxa"/>
+            <w:tcW w:w="1740" w:type="dxa"/>
           </w:tcPr>
           <w:p>
             <w:pPr>
@@ -968,7 +968,7 @@
       <w:tr>
         <w:tc>
           <w:tcPr>
-            <w:tcW w:w="421" w:type="dxa"/>
+            <w:tcW w:w="660" w:type="dxa"/>
           </w:tcPr>
           <w:p>
             <w:pPr>
@@ -994,7 +994,7 @@
         </w:tc>
         <w:tc>
           <w:tcPr>
-            <w:tcW w:w="4591" w:type="dxa"/>
+            <w:tcW w:w="4250" w:type="dxa"/>
           </w:tcPr>
           <w:p>
             <w:pPr>
@@ -1040,7 +1040,7 @@
         </w:tc>
         <w:tc>
           <w:tcPr>
-            <w:tcW w:w="738" w:type="dxa"/>
+            <w:tcW w:w="800" w:type="dxa"/>
           </w:tcPr>
           <w:p>
             <w:pPr>
@@ -1066,7 +1066,7 @@
         </w:tc>
         <w:tc>
           <w:tcPr>
-            <w:tcW w:w="1359" w:type="dxa"/>
+            <w:tcW w:w="850" w:type="dxa"/>
           </w:tcPr>
           <w:p>
             <w:pPr>
@@ -1109,7 +1109,7 @@
         </w:tc>
         <w:tc>
           <w:tcPr>
-            <w:tcW w:w="1265" w:type="dxa"/>
+            <w:tcW w:w="1050" w:type="dxa"/>
           </w:tcPr>
           <w:p>
             <w:pPr>
@@ -1152,7 +1152,7 @@
         </w:tc>
         <w:tc>
           <w:tcPr>
-            <w:tcW w:w="976" w:type="dxa"/>
+            <w:tcW w:w="1740" w:type="dxa"/>
           </w:tcPr>
           <w:p>
             <w:pPr>
@@ -1196,7 +1196,7 @@
       <w:tr>
         <w:tc>
           <w:tcPr>
-            <w:tcW w:w="421" w:type="dxa"/>
+            <w:tcW w:w="660" w:type="dxa"/>
           </w:tcPr>
           <w:p>
             <w:pPr>
@@ -1222,7 +1222,7 @@
         </w:tc>
         <w:tc>
           <w:tcPr>
-            <w:tcW w:w="4591" w:type="dxa"/>
+            <w:tcW w:w="4250" w:type="dxa"/>
           </w:tcPr>
           <w:p>
             <w:pPr>
@@ -1247,7 +1247,7 @@
         </w:tc>
         <w:tc>
           <w:tcPr>
-            <w:tcW w:w="738" w:type="dxa"/>
+            <w:tcW w:w="800" w:type="dxa"/>
           </w:tcPr>
           <w:p>
             <w:pPr>
@@ -1273,7 +1273,7 @@
         </w:tc>
         <w:tc>
           <w:tcPr>
-            <w:tcW w:w="1359" w:type="dxa"/>
+            <w:tcW w:w="850" w:type="dxa"/>
           </w:tcPr>
           <w:p>
             <w:pPr>
@@ -1316,7 +1316,7 @@
         </w:tc>
         <w:tc>
           <w:tcPr>
-            <w:tcW w:w="1265" w:type="dxa"/>
+            <w:tcW w:w="1050" w:type="dxa"/>
           </w:tcPr>
           <w:p>
             <w:pPr>
@@ -1359,7 +1359,7 @@
         </w:tc>
         <w:tc>
           <w:tcPr>
-            <w:tcW w:w="976" w:type="dxa"/>
+            <w:tcW w:w="1740" w:type="dxa"/>
           </w:tcPr>
           <w:p>
             <w:pPr>

</xml_diff>